<commit_message>
finished quarto document and added slide deck
</commit_message>
<xml_diff>
--- a/st540_project_proposal.docx
+++ b/st540_project_proposal.docx
@@ -45,7 +45,7 @@
           <w:b/>
           <w:bCs/>
         </w:rPr>
-        <w:t>-</w:t>
+        <w:t xml:space="preserve"> </w:t>
       </w:r>
       <w:r>
         <w:rPr>
@@ -289,21 +289,7 @@
         <w:rPr>
           <w:rFonts w:ascii="Times New Roman" w:hAnsi="Times New Roman" w:cs="Times New Roman"/>
         </w:rPr>
-        <w:t xml:space="preserve">These questions will be answered with a Bayesian analysis, specifically a series of generalized linear mixed models (GLMMs) with different priors. This includes Bayesian LASSO and ridge regression priors. Fixed and random effects will be modeled </w:t>
-      </w:r>
-      <w:proofErr w:type="gramStart"/>
-      <w:r>
-        <w:rPr>
-          <w:rFonts w:ascii="Times New Roman" w:hAnsi="Times New Roman" w:cs="Times New Roman"/>
-        </w:rPr>
-        <w:t>in order to</w:t>
-      </w:r>
-      <w:proofErr w:type="gramEnd"/>
-      <w:r>
-        <w:rPr>
-          <w:rFonts w:ascii="Times New Roman" w:hAnsi="Times New Roman" w:cs="Times New Roman"/>
-        </w:rPr>
-        <w:t xml:space="preserve"> estimate the impact of universal variables, as well as team or coach specific </w:t>
+        <w:t xml:space="preserve">These questions will be answered with a Bayesian analysis, specifically a series of generalized linear mixed models (GLMMs) with different priors. This includes Bayesian LASSO and ridge regression priors. Fixed and random effects will be modeled in order to estimate the impact of universal variables, as well as team or coach specific </w:t>
       </w:r>
       <w:r>
         <w:rPr>
@@ -329,7 +315,6 @@
         </w:rPr>
         <w:t xml:space="preserve"> modeling portion of the analysis will be implemented in R using </w:t>
       </w:r>
-      <w:proofErr w:type="spellStart"/>
       <w:r>
         <w:rPr>
           <w:rFonts w:ascii="Times New Roman" w:hAnsi="Times New Roman" w:cs="Times New Roman"/>
@@ -338,14 +323,12 @@
         </w:rPr>
         <w:t>blr</w:t>
       </w:r>
-      <w:proofErr w:type="spellEnd"/>
       <w:r>
         <w:rPr>
           <w:rFonts w:ascii="Times New Roman" w:hAnsi="Times New Roman" w:cs="Times New Roman"/>
         </w:rPr>
         <w:t xml:space="preserve">, </w:t>
       </w:r>
-      <w:proofErr w:type="spellStart"/>
       <w:r>
         <w:rPr>
           <w:rFonts w:ascii="Times New Roman" w:hAnsi="Times New Roman" w:cs="Times New Roman"/>
@@ -354,7 +337,6 @@
         </w:rPr>
         <w:t>rjags</w:t>
       </w:r>
-      <w:proofErr w:type="spellEnd"/>
       <w:r>
         <w:rPr>
           <w:rFonts w:ascii="Times New Roman" w:hAnsi="Times New Roman" w:cs="Times New Roman"/>
@@ -373,7 +355,6 @@
         </w:rPr>
         <w:t xml:space="preserve">other Bayesian packages that might come up in the machine learning chapter of the course. The data will be obtained from the </w:t>
       </w:r>
-      <w:proofErr w:type="spellStart"/>
       <w:r>
         <w:rPr>
           <w:rFonts w:ascii="Times New Roman" w:hAnsi="Times New Roman" w:cs="Times New Roman"/>
@@ -382,7 +363,6 @@
         </w:rPr>
         <w:t>nflreadr</w:t>
       </w:r>
-      <w:proofErr w:type="spellEnd"/>
       <w:r>
         <w:rPr>
           <w:rFonts w:ascii="Times New Roman" w:hAnsi="Times New Roman" w:cs="Times New Roman"/>
@@ -425,21 +405,7 @@
         <w:rPr>
           <w:rFonts w:ascii="Times New Roman" w:hAnsi="Times New Roman" w:cs="Times New Roman"/>
         </w:rPr>
-        <w:t xml:space="preserve">log-like Quarto markdown document will analyze the modelling process, before summarizing the information in a </w:t>
-      </w:r>
-      <w:proofErr w:type="gramStart"/>
-      <w:r>
-        <w:rPr>
-          <w:rFonts w:ascii="Times New Roman" w:hAnsi="Times New Roman" w:cs="Times New Roman"/>
-        </w:rPr>
-        <w:t>ten slide</w:t>
-      </w:r>
-      <w:proofErr w:type="gramEnd"/>
-      <w:r>
-        <w:rPr>
-          <w:rFonts w:ascii="Times New Roman" w:hAnsi="Times New Roman" w:cs="Times New Roman"/>
-        </w:rPr>
-        <w:t xml:space="preserve"> presentation.</w:t>
+        <w:t>log-like Quarto markdown document will analyze the modelling process, before summarizing the information in a ten slide presentation.</w:t>
       </w:r>
     </w:p>
     <w:sectPr>

</xml_diff>